<commit_message>
feat: setup.sh + README pentru replicare automata + reference.docx stylat
</commit_message>
<xml_diff>
--- a/docs/analiza/reference.docx
+++ b/docs/analiza/reference.docx
@@ -314,9 +314,11 @@
       </w:r>
     </w:p>
     <w:sectPr>
+      <w:footerReference w:type="default" r:id="rId9"/>
       <w:footnotePr>
         <w:numRestart w:val="eachSect"/>
       </w:footnotePr>
+      <w:pgMar w:top="1417" w:bottom="1417" w:left="1417" w:right="1417"/>
     </w:sectPr>
   </w:body>
 </w:document>
@@ -324,6 +326,26 @@
 
 <file path=word/comments.xml><?xml version="1.0" encoding="utf-8"?>
 <w:comments xmlns:w="http://schemas.openxmlformats.org/wordprocessingml/2006/main" xmlns:m="http://schemas.openxmlformats.org/officeDocument/2006/math" xmlns:r="http://schemas.openxmlformats.org/officeDocument/2006/relationships" xmlns:o="urn:schemas-microsoft-com:office:office" xmlns:v="urn:schemas-microsoft-com:vml" xmlns:w10="urn:schemas-microsoft-com:office:word" xmlns:a="http://schemas.openxmlformats.org/drawingml/2006/main" xmlns:pic="http://schemas.openxmlformats.org/drawingml/2006/picture" xmlns:wp="http://schemas.openxmlformats.org/drawingml/2006/wordprocessingDrawing"/>
+</file>
+
+<file path=word/footer1.xml><?xml version="1.0" encoding="utf-8"?>
+<w:ftr xmlns:m="http://schemas.openxmlformats.org/officeDocument/2006/math" xmlns:mc="http://schemas.openxmlformats.org/markup-compatibility/2006" xmlns:mo="http://schemas.microsoft.com/office/mac/office/2008/main" xmlns:mv="urn:schemas-microsoft-com:mac:vml" xmlns:o="urn:schemas-microsoft-com:office:office" xmlns:r="http://schemas.openxmlformats.org/officeDocument/2006/relationships" xmlns:v="urn:schemas-microsoft-com:vml" xmlns:w10="urn:schemas-microsoft-com:office:word" xmlns:w14="http://schemas.microsoft.com/office/word/2010/wordml" xmlns:w="http://schemas.openxmlformats.org/wordprocessingml/2006/main" xmlns:wne="http://schemas.microsoft.com/office/word/2006/wordml" xmlns:wp14="http://schemas.microsoft.com/office/word/2010/wordprocessingDrawing" xmlns:wp="http://schemas.openxmlformats.org/drawingml/2006/wordprocessingDrawing" xmlns:wpc="http://schemas.microsoft.com/office/word/2010/wordprocessingCanvas" xmlns:wpg="http://schemas.microsoft.com/office/word/2010/wordprocessingGroup" xmlns:wpi="http://schemas.microsoft.com/office/word/2010/wordprocessingInk" xmlns:wps="http://schemas.microsoft.com/office/word/2010/wordprocessingShape" mc:Ignorable="w14 wp14">
+  <w:p>
+    <w:pPr>
+      <w:pStyle w:val="Footer"/>
+      <w:jc w:val="center"/>
+    </w:pPr>
+    <w:r>
+      <w:rPr>
+        <w:rFonts w:ascii="Times New Roman" w:hAnsi="Times New Roman"/>
+        <w:sz w:val="22"/>
+      </w:rPr>
+      <w:fldChar w:fldCharType="begin"/>
+      <w:instrText xml:space="preserve">PAGE</w:instrText>
+      <w:fldChar w:fldCharType="end"/>
+    </w:r>
+  </w:p>
+</w:ftr>
 </file>
 
 <file path=word/footnotes.xml><?xml version="1.0" encoding="utf-8"?>
@@ -501,6 +523,17 @@
   <w:style w:type="paragraph" w:default="1" w:styleId="Normal">
     <w:name w:val="Normal"/>
     <w:qFormat/>
+    <w:pPr>
+      <w:keepNext w:val="0"/>
+      <w:spacing w:before="0" w:after="160" w:line="276" w:lineRule="auto"/>
+      <w:jc w:val="both"/>
+    </w:pPr>
+    <w:rPr>
+      <w:rFonts w:ascii="Times New Roman" w:hAnsi="Times New Roman" w:eastAsia="Times New Roman" w:cs="Times New Roman"/>
+      <w:b w:val="0"/>
+      <w:i w:val="0"/>
+      <w:sz w:val="24"/>
+    </w:rPr>
   </w:style>
   <w:style w:type="paragraph" w:styleId="BodyText">
     <w:name w:val="Body Text"/>
@@ -534,13 +567,17 @@
     <w:qFormat/>
     <w:rsid w:val="00A10FD9"/>
     <w:pPr>
-      <w:spacing w:after="80" w:line="240" w:lineRule="auto"/>
+      <w:keepNext w:val="0"/>
+      <w:spacing w:after="480" w:line="276" w:lineRule="auto" w:before="0"/>
       <w:contextualSpacing/>
       <w:jc w:val="center"/>
     </w:pPr>
     <w:rPr>
-      <w:rFonts w:asciiTheme="majorHAnsi" w:eastAsiaTheme="majorEastAsia" w:hAnsiTheme="majorHAnsi" w:cstheme="majorBidi"/>
-      <w:sz w:val="56"/>
+      <w:rFonts w:asciiTheme="majorHAnsi" w:eastAsiaTheme="majorEastAsia" w:hAnsiTheme="majorHAnsi" w:cstheme="majorBidi" w:ascii="Times New Roman" w:hAnsi="Times New Roman" w:eastAsia="Times New Roman" w:cs="Times New Roman"/>
+      <w:b/>
+      <w:i w:val="0"/>
+      <w:color w:val="000000"/>
+      <w:sz w:val="40"/>
       <w:szCs w:val="56"/>
     </w:rPr>
   </w:style>
@@ -565,12 +602,18 @@
     <w:qFormat/>
     <w:rsid w:val="00A10FD9"/>
     <w:pPr>
+      <w:keepNext w:val="0"/>
       <w:numPr>
         <w:ilvl w:val="1"/>
       </w:numPr>
-    </w:pPr>
-    <w:rPr>
-      <w:rFonts w:eastAsiaTheme="majorEastAsia" w:cstheme="majorBidi"/>
+      <w:spacing w:before="0" w:after="240" w:line="276" w:lineRule="auto"/>
+      <w:jc w:val="center"/>
+    </w:pPr>
+    <w:rPr>
+      <w:rFonts w:eastAsiaTheme="majorEastAsia" w:cstheme="majorBidi" w:ascii="Times New Roman" w:hAnsi="Times New Roman" w:eastAsia="Times New Roman" w:cs="Times New Roman"/>
+      <w:b w:val="0"/>
+      <w:i/>
+      <w:color w:val="505050"/>
       <w:spacing w:val="15"/>
       <w:sz w:val="28"/>
       <w:szCs w:val="28"/>
@@ -596,10 +639,15 @@
     <w:next w:val="BodyText"/>
     <w:qFormat/>
     <w:pPr>
-      <w:keepNext/>
+      <w:keepNext w:val="0"/>
       <w:keepLines/>
-    </w:pPr>
-    <w:rPr>
+      <w:spacing w:before="0" w:after="80" w:line="276" w:lineRule="auto"/>
+      <w:jc w:val="center"/>
+    </w:pPr>
+    <w:rPr>
+      <w:rFonts w:ascii="Times New Roman" w:hAnsi="Times New Roman" w:eastAsia="Times New Roman" w:cs="Times New Roman"/>
+      <w:b w:val="0"/>
+      <w:i w:val="0"/>
       <w:sz w:val="24"/>
       <w:szCs w:val="24"/>
     </w:rPr>
@@ -610,10 +658,15 @@
     <w:next w:val="BodyText"/>
     <w:qFormat/>
     <w:pPr>
-      <w:keepNext/>
+      <w:keepNext w:val="0"/>
       <w:keepLines/>
-    </w:pPr>
-    <w:rPr>
+      <w:spacing w:before="0" w:after="80" w:line="276" w:lineRule="auto"/>
+      <w:jc w:val="center"/>
+    </w:pPr>
+    <w:rPr>
+      <w:rFonts w:ascii="Times New Roman" w:hAnsi="Times New Roman" w:eastAsia="Times New Roman" w:cs="Times New Roman"/>
+      <w:b w:val="0"/>
+      <w:i w:val="0"/>
       <w:sz w:val="24"/>
       <w:szCs w:val="24"/>
     </w:rPr>
@@ -669,13 +722,16 @@
     <w:pPr>
       <w:keepNext/>
       <w:keepLines/>
-      <w:spacing w:before="360" w:after="80"/>
+      <w:spacing w:before="480" w:after="240" w:line="276" w:lineRule="auto"/>
+      <w:jc w:val="left"/>
       <w:outlineLvl w:val="0"/>
     </w:pPr>
     <w:rPr>
-      <w:rFonts w:asciiTheme="majorHAnsi" w:eastAsiaTheme="majorEastAsia" w:hAnsiTheme="majorHAnsi" w:cstheme="majorBidi"/>
-      <w:color w:val="0F4761" w:themeColor="accent1" w:themeShade="BF"/>
-      <w:sz w:val="40"/>
+      <w:rFonts w:asciiTheme="majorHAnsi" w:eastAsiaTheme="majorEastAsia" w:hAnsiTheme="majorHAnsi" w:cstheme="majorBidi" w:ascii="Times New Roman" w:hAnsi="Times New Roman" w:eastAsia="Times New Roman" w:cs="Times New Roman"/>
+      <w:b/>
+      <w:i w:val="0"/>
+      <w:color w:val="000000"/>
+      <w:sz w:val="32"/>
       <w:szCs w:val="40"/>
     </w:rPr>
   </w:style>
@@ -692,13 +748,16 @@
     <w:pPr>
       <w:keepNext/>
       <w:keepLines/>
-      <w:spacing w:before="160" w:after="80"/>
+      <w:spacing w:before="360" w:after="120" w:line="276" w:lineRule="auto"/>
+      <w:jc w:val="left"/>
       <w:outlineLvl w:val="1"/>
     </w:pPr>
     <w:rPr>
-      <w:rFonts w:asciiTheme="majorHAnsi" w:eastAsiaTheme="majorEastAsia" w:hAnsiTheme="majorHAnsi" w:cstheme="majorBidi"/>
-      <w:color w:val="0F4761" w:themeColor="accent1" w:themeShade="BF"/>
-      <w:sz w:val="32"/>
+      <w:rFonts w:asciiTheme="majorHAnsi" w:eastAsiaTheme="majorEastAsia" w:hAnsiTheme="majorHAnsi" w:cstheme="majorBidi" w:ascii="Times New Roman" w:hAnsi="Times New Roman" w:eastAsia="Times New Roman" w:cs="Times New Roman"/>
+      <w:b/>
+      <w:i w:val="0"/>
+      <w:color w:val="000000"/>
+      <w:sz w:val="28"/>
       <w:szCs w:val="32"/>
     </w:rPr>
   </w:style>
@@ -715,13 +774,16 @@
     <w:pPr>
       <w:keepNext/>
       <w:keepLines/>
-      <w:spacing w:before="160" w:after="80"/>
+      <w:spacing w:before="240" w:after="120" w:line="276" w:lineRule="auto"/>
+      <w:jc w:val="left"/>
       <w:outlineLvl w:val="2"/>
     </w:pPr>
     <w:rPr>
-      <w:rFonts w:eastAsiaTheme="majorEastAsia" w:cstheme="majorBidi"/>
-      <w:color w:val="0F4761" w:themeColor="accent1" w:themeShade="BF"/>
-      <w:sz w:val="28"/>
+      <w:rFonts w:eastAsiaTheme="majorEastAsia" w:cstheme="majorBidi" w:ascii="Times New Roman" w:hAnsi="Times New Roman" w:eastAsia="Times New Roman" w:cs="Times New Roman"/>
+      <w:b/>
+      <w:i w:val="0"/>
+      <w:color w:val="000000"/>
+      <w:sz w:val="24"/>
       <w:szCs w:val="28"/>
     </w:rPr>
   </w:style>

</xml_diff>